<commit_message>
Update planning instructions and checklist wording
</commit_message>
<xml_diff>
--- a/01_WEBSITE/99_SOURCES/CHECKMARK_AUDIO_WEBSITE_SOURCE_OF_TRUTH.docx
+++ b/01_WEBSITE/99_SOURCES/CHECKMARK_AUDIO_WEBSITE_SOURCE_OF_TRUTH.docx
@@ -221,7 +221,7 @@
         <w:rPr>
           <w:sz w:val="22"/>
         </w:rPr>
-        <w:t>A visitor should immediately understand that Checkmark Audio is a professional Albuquerque studio for recording, production, mixing, mastering, and artist development.</w:t>
+        <w:t>Checkmark Audio is a professional recording studio in Albuquerque offering recording, production, mixing, mastering, and artist development services for artists who want polished, release-ready sound.</w:t>
       </w:r>
     </w:p>
     <w:p>
@@ -248,7 +248,7 @@
         <w:rPr>
           <w:sz w:val="22"/>
         </w:rPr>
-        <w:t>A visitor should know the studio serves artists, bands, vocalists, creators, students, and clients who need professional audio support.</w:t>
+        <w:t>Checkmark Audio works with vocalists, rappers, singer-songwriters, bands, podcasters, creators, students, and anyone looking for professional audio support in a comfortable studio environment.</w:t>
       </w:r>
     </w:p>
     <w:p>
@@ -275,7 +275,7 @@
         <w:rPr>
           <w:sz w:val="22"/>
         </w:rPr>
-        <w:t>A visitor should be able to scan the main services and choose the right next step without confusion.</w:t>
+        <w:t>Clients can easily explore recording, production, mixing, mastering, artist media, and education services, then choose the option that best fits their project.</w:t>
       </w:r>
     </w:p>
     <w:p>
@@ -302,7 +302,7 @@
         <w:rPr>
           <w:sz w:val="22"/>
         </w:rPr>
-        <w:t>A visitor should see clear starting points or know when a custom quote is needed.</w:t>
+        <w:t>Clients can view clear starting prices where available and request a custom quote when a project needs a more personalized plan.</w:t>
       </w:r>
     </w:p>
     <w:p>
@@ -329,7 +329,7 @@
         <w:rPr>
           <w:sz w:val="22"/>
         </w:rPr>
-        <w:t>A visitor should see experience, professionalism, real work, reviews, and proof that Checkmark can deliver quality results.</w:t>
+        <w:t>Clients can see that Checkmark Audio combines professional experience, high-quality studio standards, real project work, client reviews, and a commitment to helping artists sound their best.</w:t>
       </w:r>
     </w:p>
     <w:p>
@@ -356,7 +356,7 @@
         <w:rPr>
           <w:sz w:val="22"/>
         </w:rPr>
-        <w:t>A visitor should always know how to request a session, free consultation, call, text, or email.</w:t>
+        <w:t>Clients can quickly request a session, schedule a free consultation, call, text, or email Checkmark Audio without having to search for the next step.</w:t>
       </w:r>
     </w:p>
     <w:p>
@@ -383,7 +383,7 @@
         <w:rPr>
           <w:sz w:val="22"/>
         </w:rPr>
-        <w:t>A visitor should easily find the studio address and understand that Checkmark Audio is based in Albuquerque, New Mexico.</w:t>
+        <w:t>Clients can easily find Checkmark Audio’s studio address and understand that the studio is based in Albuquerque, New Mexico.</w:t>
       </w:r>
     </w:p>
     <w:p>
@@ -410,7 +410,7 @@
         <w:rPr>
           <w:sz w:val="22"/>
         </w:rPr>
-        <w:t>A visitor should be able to hear, watch, or see examples of studio work, artist media, and finished projects.</w:t>
+        <w:t>Clients can hear, watch, and view examples of finished music, studio sessions, artist media, and real Checkmark Audio projects.</w:t>
       </w:r>
     </w:p>
     <w:p>
@@ -437,7 +437,7 @@
         <w:rPr>
           <w:sz w:val="22"/>
         </w:rPr>
-        <w:t>A visitor should understand the education pathway without the school distracting from the main studio services.</w:t>
+        <w:t>Clients can understand that Checkmark Audio School is the studio’s education pathway for people who want to learn audio engineering, production, and studio skills.</w:t>
       </w:r>
     </w:p>
     <w:p>
@@ -464,7 +464,7 @@
         <w:rPr>
           <w:sz w:val="22"/>
         </w:rPr>
-        <w:t>A visitor should leave each major page with one clear action, usually booking a consultation or contacting the studio.</w:t>
+        <w:t>Every major page gives clients a clear next step, whether that is booking a consultation, asking a question, or contacting the studio directly.</w:t>
       </w:r>
     </w:p>
     <w:p>

</xml_diff>